<commit_message>
Use survey results in IMR draft
</commit_message>
<xml_diff>
--- a/Submissions/Class_Group_Name_IMR.docx
+++ b/Submissions/Class_Group_Name_IMR.docx
@@ -570,92 +570,174 @@
           <w:rFonts w:ascii="Times New Roman" w:hAnsi="Times New Roman" w:eastAsia="Times New Roman"/>
           <w:sz w:val="22"/>
         </w:rPr>
-        <w:t xml:space="preserve">Participants will be recruited through convenience sampling among university students. The</w:t>
-      </w:r>
-      <w:r>
-        <w:rPr>
-          <w:rFonts w:ascii="Times New Roman" w:hAnsi="Times New Roman" w:eastAsia="Times New Roman"/>
-          <w:sz w:val="22"/>
-        </w:rPr>
-        <w:t xml:space="preserve"> </w:t>
-      </w:r>
-      <w:r>
-        <w:rPr>
-          <w:rFonts w:ascii="Times New Roman" w:hAnsi="Times New Roman" w:eastAsia="Times New Roman"/>
-          <w:sz w:val="22"/>
-        </w:rPr>
-        <w:t xml:space="preserve">survey is distributed online through Wenjuanxing. Eligible participants should be currently</w:t>
-      </w:r>
-      <w:r>
-        <w:rPr>
-          <w:rFonts w:ascii="Times New Roman" w:hAnsi="Times New Roman" w:eastAsia="Times New Roman"/>
-          <w:sz w:val="22"/>
-        </w:rPr>
-        <w:t xml:space="preserve"> </w:t>
-      </w:r>
-      <w:r>
-        <w:rPr>
-          <w:rFonts w:ascii="Times New Roman" w:hAnsi="Times New Roman" w:eastAsia="Times New Roman"/>
-          <w:sz w:val="22"/>
-        </w:rPr>
-        <w:t xml:space="preserve">enrolled university students aged 18 or above. The final paper will replace</w:t>
-      </w:r>
-      <w:r>
-        <w:rPr>
-          <w:rFonts w:ascii="Times New Roman" w:hAnsi="Times New Roman" w:eastAsia="Times New Roman"/>
-          <w:sz w:val="22"/>
-        </w:rPr>
-        <w:t xml:space="preserve"> </w:t>
-      </w:r>
-      <w:r>
-        <w:rPr>
-          <w:rStyle w:val="VerbatimChar"/>
-          <w:rFonts w:ascii="Times New Roman" w:hAnsi="Times New Roman" w:eastAsia="Times New Roman"/>
-          <w:sz w:val="22"/>
-        </w:rPr>
-        <w:t xml:space="preserve">[N]</w:t>
-      </w:r>
-      <w:r>
-        <w:rPr>
-          <w:rFonts w:ascii="Times New Roman" w:hAnsi="Times New Roman" w:eastAsia="Times New Roman"/>
-          <w:sz w:val="22"/>
-        </w:rPr>
-        <w:t xml:space="preserve"> </w:t>
-      </w:r>
-      <w:r>
-        <w:rPr>
-          <w:rFonts w:ascii="Times New Roman" w:hAnsi="Times New Roman" w:eastAsia="Times New Roman"/>
-          <w:sz w:val="22"/>
-        </w:rPr>
-        <w:t xml:space="preserve">with the</w:t>
-      </w:r>
-      <w:r>
-        <w:rPr>
-          <w:rFonts w:ascii="Times New Roman" w:hAnsi="Times New Roman" w:eastAsia="Times New Roman"/>
-          <w:sz w:val="22"/>
-        </w:rPr>
-        <w:t xml:space="preserve"> </w:t>
-      </w:r>
-      <w:r>
-        <w:rPr>
-          <w:rFonts w:ascii="Times New Roman" w:hAnsi="Times New Roman" w:eastAsia="Times New Roman"/>
-          <w:sz w:val="22"/>
-        </w:rPr>
-        <w:t xml:space="preserve">number of valid responses collected after removing invalid responses based on the attention</w:t>
-      </w:r>
-      <w:r>
-        <w:rPr>
-          <w:rFonts w:ascii="Times New Roman" w:hAnsi="Times New Roman" w:eastAsia="Times New Roman"/>
-          <w:sz w:val="22"/>
-        </w:rPr>
-        <w:t xml:space="preserve"> </w:t>
-      </w:r>
-      <w:r>
-        <w:rPr>
-          <w:rFonts w:ascii="Times New Roman" w:hAnsi="Times New Roman" w:eastAsia="Times New Roman"/>
-          <w:sz w:val="22"/>
-        </w:rPr>
-        <w:t xml:space="preserve">check.</w:t>
+        <w:t xml:space="preserve">Participants were recruited through convenience sampling and completed the survey online</w:t>
+      </w:r>
+      <w:r>
+        <w:rPr>
+          <w:rFonts w:ascii="Times New Roman" w:hAnsi="Times New Roman" w:eastAsia="Times New Roman"/>
+          <w:sz w:val="22"/>
+        </w:rPr>
+        <w:t xml:space="preserve"> </w:t>
+      </w:r>
+      <w:r>
+        <w:rPr>
+          <w:rFonts w:ascii="Times New Roman" w:hAnsi="Times New Roman" w:eastAsia="Times New Roman"/>
+          <w:sz w:val="22"/>
+        </w:rPr>
+        <w:t xml:space="preserve">through Wenjuanxing. A total of 79 responses were collected. Ten responses failed the Q42</w:t>
+      </w:r>
+      <w:r>
+        <w:rPr>
+          <w:rFonts w:ascii="Times New Roman" w:hAnsi="Times New Roman" w:eastAsia="Times New Roman"/>
+          <w:sz w:val="22"/>
+        </w:rPr>
+        <w:t xml:space="preserve"> </w:t>
+      </w:r>
+      <w:r>
+        <w:rPr>
+          <w:rFonts w:ascii="Times New Roman" w:hAnsi="Times New Roman" w:eastAsia="Times New Roman"/>
+          <w:sz w:val="22"/>
+        </w:rPr>
+        <w:t xml:space="preserve">attention-check item, and three attention-check passers reported</w:t>
+      </w:r>
+      <w:r>
+        <w:rPr>
+          <w:rFonts w:ascii="Times New Roman" w:hAnsi="Times New Roman" w:eastAsia="Times New Roman"/>
+          <w:sz w:val="22"/>
+        </w:rPr>
+        <w:t xml:space="preserve"> </w:t>
+      </w:r>
+      <w:r>
+        <w:rPr>
+          <w:rFonts w:ascii="Times New Roman" w:hAnsi="Times New Roman" w:eastAsia="Times New Roman"/>
+          <w:sz w:val="22"/>
+        </w:rPr>
+        <w:t xml:space="preserve">“</w:t>
+      </w:r>
+      <w:r>
+        <w:rPr>
+          <w:rFonts w:ascii="Times New Roman" w:hAnsi="Times New Roman" w:eastAsia="Times New Roman"/>
+          <w:sz w:val="22"/>
+        </w:rPr>
+        <w:t xml:space="preserve">high school or below</w:t>
+      </w:r>
+      <w:r>
+        <w:rPr>
+          <w:rFonts w:ascii="Times New Roman" w:hAnsi="Times New Roman" w:eastAsia="Times New Roman"/>
+          <w:sz w:val="22"/>
+        </w:rPr>
+        <w:t xml:space="preserve">”</w:t>
+      </w:r>
+      <w:r>
+        <w:rPr>
+          <w:rFonts w:ascii="Times New Roman" w:hAnsi="Times New Roman" w:eastAsia="Times New Roman"/>
+          <w:sz w:val="22"/>
+        </w:rPr>
+        <w:t xml:space="preserve"> </w:t>
+      </w:r>
+      <w:r>
+        <w:rPr>
+          <w:rFonts w:ascii="Times New Roman" w:hAnsi="Times New Roman" w:eastAsia="Times New Roman"/>
+          <w:sz w:val="22"/>
+        </w:rPr>
+        <w:t xml:space="preserve">as</w:t>
+      </w:r>
+      <w:r>
+        <w:rPr>
+          <w:rFonts w:ascii="Times New Roman" w:hAnsi="Times New Roman" w:eastAsia="Times New Roman"/>
+          <w:sz w:val="22"/>
+        </w:rPr>
+        <w:t xml:space="preserve"> </w:t>
+      </w:r>
+      <w:r>
+        <w:rPr>
+          <w:rFonts w:ascii="Times New Roman" w:hAnsi="Times New Roman" w:eastAsia="Times New Roman"/>
+          <w:sz w:val="22"/>
+        </w:rPr>
+        <w:t xml:space="preserve">their current education level. These responses were excluded from the main analysis so that</w:t>
+      </w:r>
+      <w:r>
+        <w:rPr>
+          <w:rFonts w:ascii="Times New Roman" w:hAnsi="Times New Roman" w:eastAsia="Times New Roman"/>
+          <w:sz w:val="22"/>
+        </w:rPr>
+        <w:t xml:space="preserve"> </w:t>
+      </w:r>
+      <w:r>
+        <w:rPr>
+          <w:rFonts w:ascii="Times New Roman" w:hAnsi="Times New Roman" w:eastAsia="Times New Roman"/>
+          <w:sz w:val="22"/>
+        </w:rPr>
+        <w:t xml:space="preserve">the analytic sample matched the study’s university-level focus. The final analytic sample</w:t>
+      </w:r>
+      <w:r>
+        <w:rPr>
+          <w:rFonts w:ascii="Times New Roman" w:hAnsi="Times New Roman" w:eastAsia="Times New Roman"/>
+          <w:sz w:val="22"/>
+        </w:rPr>
+        <w:t xml:space="preserve"> </w:t>
+      </w:r>
+      <w:r>
+        <w:rPr>
+          <w:rFonts w:ascii="Times New Roman" w:hAnsi="Times New Roman" w:eastAsia="Times New Roman"/>
+          <w:sz w:val="22"/>
+        </w:rPr>
+        <w:t xml:space="preserve">therefore included 66 valid university-level respondents.</w:t>
+      </w:r>
+    </w:p>
+    <w:p>
+      <w:pPr>
+        <w:pStyle w:val="BodyText"/>
+        <w:spacing w:line="480" w:lineRule="auto" w:before="0" w:after="0"/>
+      </w:pPr>
+      <w:r>
+        <w:rPr>
+          <w:rFonts w:ascii="Times New Roman" w:hAnsi="Times New Roman" w:eastAsia="Times New Roman"/>
+          <w:sz w:val="22"/>
+        </w:rPr>
+        <w:t xml:space="preserve">Within this analytic sample, 26 respondents were first-year students, 14 were second-year</w:t>
+      </w:r>
+      <w:r>
+        <w:rPr>
+          <w:rFonts w:ascii="Times New Roman" w:hAnsi="Times New Roman" w:eastAsia="Times New Roman"/>
+          <w:sz w:val="22"/>
+        </w:rPr>
+        <w:t xml:space="preserve"> </w:t>
+      </w:r>
+      <w:r>
+        <w:rPr>
+          <w:rFonts w:ascii="Times New Roman" w:hAnsi="Times New Roman" w:eastAsia="Times New Roman"/>
+          <w:sz w:val="22"/>
+        </w:rPr>
+        <w:t xml:space="preserve">students, 10 were third-year students, and 16 were fourth-year-or-above students or recent</w:t>
+      </w:r>
+      <w:r>
+        <w:rPr>
+          <w:rFonts w:ascii="Times New Roman" w:hAnsi="Times New Roman" w:eastAsia="Times New Roman"/>
+          <w:sz w:val="22"/>
+        </w:rPr>
+        <w:t xml:space="preserve"> </w:t>
+      </w:r>
+      <w:r>
+        <w:rPr>
+          <w:rFonts w:ascii="Times New Roman" w:hAnsi="Times New Roman" w:eastAsia="Times New Roman"/>
+          <w:sz w:val="22"/>
+        </w:rPr>
+        <w:t xml:space="preserve">graduates. Most respondents used social media for at least one hour per day, and most had used</w:t>
+      </w:r>
+      <w:r>
+        <w:rPr>
+          <w:rFonts w:ascii="Times New Roman" w:hAnsi="Times New Roman" w:eastAsia="Times New Roman"/>
+          <w:sz w:val="22"/>
+        </w:rPr>
+        <w:t xml:space="preserve"> </w:t>
+      </w:r>
+      <w:r>
+        <w:rPr>
+          <w:rFonts w:ascii="Times New Roman" w:hAnsi="Times New Roman" w:eastAsia="Times New Roman"/>
+          <w:sz w:val="22"/>
+        </w:rPr>
+        <w:t xml:space="preserve">AI tools either daily or weekly.</w:t>
       </w:r>
     </w:p>
     <w:bookmarkEnd w:id="22"/>
@@ -1716,75 +1798,169 @@
           <w:rFonts w:ascii="Times New Roman" w:hAnsi="Times New Roman" w:eastAsia="Times New Roman"/>
           <w:sz w:val="22"/>
         </w:rPr>
-        <w:t xml:space="preserve">At the time of this draft, the questionnaire has been finalized but the response data have not</w:t>
-      </w:r>
-      <w:r>
-        <w:rPr>
-          <w:rFonts w:ascii="Times New Roman" w:hAnsi="Times New Roman" w:eastAsia="Times New Roman"/>
-          <w:sz w:val="22"/>
-        </w:rPr>
-        <w:t xml:space="preserve"> </w:t>
-      </w:r>
-      <w:r>
-        <w:rPr>
-          <w:rFonts w:ascii="Times New Roman" w:hAnsi="Times New Roman" w:eastAsia="Times New Roman"/>
-          <w:sz w:val="22"/>
-        </w:rPr>
-        <w:t xml:space="preserve">yet been collected. The final paper will report the valid sample size after excluding</w:t>
-      </w:r>
-      <w:r>
-        <w:rPr>
-          <w:rFonts w:ascii="Times New Roman" w:hAnsi="Times New Roman" w:eastAsia="Times New Roman"/>
-          <w:sz w:val="22"/>
-        </w:rPr>
-        <w:t xml:space="preserve"> </w:t>
-      </w:r>
-      <w:r>
-        <w:rPr>
-          <w:rFonts w:ascii="Times New Roman" w:hAnsi="Times New Roman" w:eastAsia="Times New Roman"/>
-          <w:sz w:val="22"/>
-        </w:rPr>
-        <w:t xml:space="preserve">responses that fail the Q42 attention-check item. The planned results section will report</w:t>
-      </w:r>
-      <w:r>
-        <w:rPr>
-          <w:rFonts w:ascii="Times New Roman" w:hAnsi="Times New Roman" w:eastAsia="Times New Roman"/>
-          <w:sz w:val="22"/>
-        </w:rPr>
-        <w:t xml:space="preserve"> </w:t>
-      </w:r>
-      <w:r>
-        <w:rPr>
-          <w:rFonts w:ascii="Times New Roman" w:hAnsi="Times New Roman" w:eastAsia="Times New Roman"/>
-          <w:sz w:val="22"/>
-        </w:rPr>
-        <w:t xml:space="preserve">descriptive statistics rather than strong causal claims, because the survey uses convenience</w:t>
-      </w:r>
-      <w:r>
-        <w:rPr>
-          <w:rFonts w:ascii="Times New Roman" w:hAnsi="Times New Roman" w:eastAsia="Times New Roman"/>
-          <w:sz w:val="22"/>
-        </w:rPr>
-        <w:t xml:space="preserve"> </w:t>
-      </w:r>
-      <w:r>
-        <w:rPr>
-          <w:rFonts w:ascii="Times New Roman" w:hAnsi="Times New Roman" w:eastAsia="Times New Roman"/>
-          <w:sz w:val="22"/>
-        </w:rPr>
-        <w:t xml:space="preserve">sampling and is intended as a supplementary local experiment.</w:t>
+        <w:t xml:space="preserve">The Wenjuanxing survey collected 79 responses. Of these, 69 responses passed the Q42</w:t>
+      </w:r>
+      <w:r>
+        <w:rPr>
+          <w:rFonts w:ascii="Times New Roman" w:hAnsi="Times New Roman" w:eastAsia="Times New Roman"/>
+          <w:sz w:val="22"/>
+        </w:rPr>
+        <w:t xml:space="preserve"> </w:t>
+      </w:r>
+      <w:r>
+        <w:rPr>
+          <w:rFonts w:ascii="Times New Roman" w:hAnsi="Times New Roman" w:eastAsia="Times New Roman"/>
+          <w:sz w:val="22"/>
+        </w:rPr>
+        <w:t xml:space="preserve">attention-check item, giving an attention-check pass rate of 87.3%. Three attention-check</w:t>
+      </w:r>
+      <w:r>
+        <w:rPr>
+          <w:rFonts w:ascii="Times New Roman" w:hAnsi="Times New Roman" w:eastAsia="Times New Roman"/>
+          <w:sz w:val="22"/>
+        </w:rPr>
+        <w:t xml:space="preserve"> </w:t>
+      </w:r>
+      <w:r>
+        <w:rPr>
+          <w:rFonts w:ascii="Times New Roman" w:hAnsi="Times New Roman" w:eastAsia="Times New Roman"/>
+          <w:sz w:val="22"/>
+        </w:rPr>
+        <w:t xml:space="preserve">passers reported</w:t>
+      </w:r>
+      <w:r>
+        <w:rPr>
+          <w:rFonts w:ascii="Times New Roman" w:hAnsi="Times New Roman" w:eastAsia="Times New Roman"/>
+          <w:sz w:val="22"/>
+        </w:rPr>
+        <w:t xml:space="preserve"> </w:t>
+      </w:r>
+      <w:r>
+        <w:rPr>
+          <w:rFonts w:ascii="Times New Roman" w:hAnsi="Times New Roman" w:eastAsia="Times New Roman"/>
+          <w:sz w:val="22"/>
+        </w:rPr>
+        <w:t xml:space="preserve">“</w:t>
+      </w:r>
+      <w:r>
+        <w:rPr>
+          <w:rFonts w:ascii="Times New Roman" w:hAnsi="Times New Roman" w:eastAsia="Times New Roman"/>
+          <w:sz w:val="22"/>
+        </w:rPr>
+        <w:t xml:space="preserve">high school or below</w:t>
+      </w:r>
+      <w:r>
+        <w:rPr>
+          <w:rFonts w:ascii="Times New Roman" w:hAnsi="Times New Roman" w:eastAsia="Times New Roman"/>
+          <w:sz w:val="22"/>
+        </w:rPr>
+        <w:t xml:space="preserve">”</w:t>
+      </w:r>
+      <w:r>
+        <w:rPr>
+          <w:rFonts w:ascii="Times New Roman" w:hAnsi="Times New Roman" w:eastAsia="Times New Roman"/>
+          <w:sz w:val="22"/>
+        </w:rPr>
+        <w:t xml:space="preserve"> </w:t>
+      </w:r>
+      <w:r>
+        <w:rPr>
+          <w:rFonts w:ascii="Times New Roman" w:hAnsi="Times New Roman" w:eastAsia="Times New Roman"/>
+          <w:sz w:val="22"/>
+        </w:rPr>
+        <w:t xml:space="preserve">as their education level and were excluded because the</w:t>
+      </w:r>
+      <w:r>
+        <w:rPr>
+          <w:rFonts w:ascii="Times New Roman" w:hAnsi="Times New Roman" w:eastAsia="Times New Roman"/>
+          <w:sz w:val="22"/>
+        </w:rPr>
+        <w:t xml:space="preserve"> </w:t>
+      </w:r>
+      <w:r>
+        <w:rPr>
+          <w:rFonts w:ascii="Times New Roman" w:hAnsi="Times New Roman" w:eastAsia="Times New Roman"/>
+          <w:sz w:val="22"/>
+        </w:rPr>
+        <w:t xml:space="preserve">study focuses on university-level respondents. The final analytic sample therefore included</w:t>
+      </w:r>
+      <w:r>
+        <w:rPr>
+          <w:rFonts w:ascii="Times New Roman" w:hAnsi="Times New Roman" w:eastAsia="Times New Roman"/>
+          <w:sz w:val="22"/>
+        </w:rPr>
+        <w:t xml:space="preserve"> </w:t>
+      </w:r>
+      <w:r>
+        <w:rPr>
+          <w:rFonts w:ascii="Times New Roman" w:hAnsi="Times New Roman" w:eastAsia="Times New Roman"/>
+          <w:sz w:val="22"/>
+        </w:rPr>
+        <w:t xml:space="preserve">66 valid responses.</w:t>
+      </w:r>
+    </w:p>
+    <w:p>
+      <w:pPr>
+        <w:pStyle w:val="BodyText"/>
+        <w:spacing w:line="480" w:lineRule="auto" w:before="0" w:after="0"/>
+      </w:pPr>
+      <w:r>
+        <w:rPr>
+          <w:rFonts w:ascii="Times New Roman" w:hAnsi="Times New Roman" w:eastAsia="Times New Roman"/>
+          <w:sz w:val="22"/>
+        </w:rPr>
+        <w:t xml:space="preserve">Across all 18 image source-judgement items, the mean detection accuracy was 47.4%. Accuracy</w:t>
+      </w:r>
+      <w:r>
+        <w:rPr>
+          <w:rFonts w:ascii="Times New Roman" w:hAnsi="Times New Roman" w:eastAsia="Times New Roman"/>
+          <w:sz w:val="22"/>
+        </w:rPr>
+        <w:t xml:space="preserve"> </w:t>
+      </w:r>
+      <w:r>
+        <w:rPr>
+          <w:rFonts w:ascii="Times New Roman" w:hAnsi="Times New Roman" w:eastAsia="Times New Roman"/>
+          <w:sz w:val="22"/>
+        </w:rPr>
+        <w:t xml:space="preserve">was higher for AI-generated images (52.9%) than for real images or screenshots (41.9%).</w:t>
+      </w:r>
+      <w:r>
+        <w:rPr>
+          <w:rFonts w:ascii="Times New Roman" w:hAnsi="Times New Roman" w:eastAsia="Times New Roman"/>
+          <w:sz w:val="22"/>
+        </w:rPr>
+        <w:t xml:space="preserve"> </w:t>
+      </w:r>
+      <w:r>
+        <w:rPr>
+          <w:rFonts w:ascii="Times New Roman" w:hAnsi="Times New Roman" w:eastAsia="Times New Roman"/>
+          <w:sz w:val="22"/>
+        </w:rPr>
+        <w:t xml:space="preserve">This pattern suggests that respondents were not simply accepting all images as real. Instead,</w:t>
+      </w:r>
+      <w:r>
+        <w:rPr>
+          <w:rFonts w:ascii="Times New Roman" w:hAnsi="Times New Roman" w:eastAsia="Times New Roman"/>
+          <w:sz w:val="22"/>
+        </w:rPr>
+        <w:t xml:space="preserve"> </w:t>
+      </w:r>
+      <w:r>
+        <w:rPr>
+          <w:rFonts w:ascii="Times New Roman" w:hAnsi="Times New Roman" w:eastAsia="Times New Roman"/>
+          <w:sz w:val="22"/>
+        </w:rPr>
+        <w:t xml:space="preserve">many real images were treated with suspicion and misclassified as AI-generated.</w:t>
       </w:r>
     </w:p>
     <w:tbl>
       <w:tblPr>
         <w:tblStyle w:val="Table"/>
-        <w:tblW w:type="pct" w:w="5000.0"/>
+        <w:tblW w:type="pct" w:w="0.0"/>
         <w:tblLook w:firstRow="1" w:lastRow="0" w:firstColumn="0" w:lastColumn="0" w:noHBand="0" w:noVBand="0" w:val="0020"/>
       </w:tblPr>
-      <w:tblGrid>
-        <w:gridCol w:w="3960"/>
-        <w:gridCol w:w="3960"/>
-      </w:tblGrid>
+      <w:tblGrid/>
       <w:tr>
         <w:tc>
           <w:p>
@@ -1798,7 +1974,7 @@
                 <w:rFonts w:ascii="Times New Roman" w:hAnsi="Times New Roman" w:eastAsia="Times New Roman"/>
                 <w:sz w:val="22"/>
               </w:rPr>
-              <w:t xml:space="preserve">Result item</w:t>
+              <w:t xml:space="preserve">Image category</w:t>
             </w:r>
           </w:p>
         </w:tc>
@@ -1807,14 +1983,14 @@
             <w:pPr>
               <w:pStyle w:val="Compact"/>
               <w:spacing w:line="480" w:lineRule="auto" w:before="0" w:after="0"/>
-              <w:jc w:val="left"/>
+              <w:jc w:val="right"/>
             </w:pPr>
             <w:r>
               <w:rPr>
                 <w:rFonts w:ascii="Times New Roman" w:hAnsi="Times New Roman" w:eastAsia="Times New Roman"/>
                 <w:sz w:val="22"/>
               </w:rPr>
-              <w:t xml:space="preserve">Planned report</w:t>
+              <w:t xml:space="preserve">Accuracy</w:t>
             </w:r>
           </w:p>
         </w:tc>
@@ -1832,7 +2008,7 @@
                 <w:rFonts w:ascii="Times New Roman" w:hAnsi="Times New Roman" w:eastAsia="Times New Roman"/>
                 <w:sz w:val="22"/>
               </w:rPr>
-              <w:t xml:space="preserve">Valid sample</w:t>
+              <w:t xml:space="preserve">Text-bearing visual artifacts</w:t>
             </w:r>
           </w:p>
         </w:tc>
@@ -1841,14 +2017,14 @@
             <w:pPr>
               <w:pStyle w:val="Compact"/>
               <w:spacing w:line="480" w:lineRule="auto" w:before="0" w:after="0"/>
-              <w:jc w:val="left"/>
+              <w:jc w:val="right"/>
             </w:pPr>
             <w:r>
               <w:rPr>
                 <w:rFonts w:ascii="Times New Roman" w:hAnsi="Times New Roman" w:eastAsia="Times New Roman"/>
                 <w:sz w:val="22"/>
               </w:rPr>
-              <w:t xml:space="preserve">Number of valid responses after the Q42 attention check</w:t>
+              <w:t xml:space="preserve">56.8%</w:t>
             </w:r>
           </w:p>
         </w:tc>
@@ -1866,7 +2042,7 @@
                 <w:rFonts w:ascii="Times New Roman" w:hAnsi="Times New Roman" w:eastAsia="Times New Roman"/>
                 <w:sz w:val="22"/>
               </w:rPr>
-              <w:t xml:space="preserve">Overall detection accuracy</w:t>
+              <w:t xml:space="preserve">Portrait images</w:t>
             </w:r>
           </w:p>
         </w:tc>
@@ -1875,14 +2051,14 @@
             <w:pPr>
               <w:pStyle w:val="Compact"/>
               <w:spacing w:line="480" w:lineRule="auto" w:before="0" w:after="0"/>
-              <w:jc w:val="left"/>
+              <w:jc w:val="right"/>
             </w:pPr>
             <w:r>
               <w:rPr>
                 <w:rFonts w:ascii="Times New Roman" w:hAnsi="Times New Roman" w:eastAsia="Times New Roman"/>
                 <w:sz w:val="22"/>
               </w:rPr>
-              <w:t xml:space="preserve">Mean accuracy across all 18 source-judgement items</w:t>
+              <w:t xml:space="preserve">39.8%</w:t>
             </w:r>
           </w:p>
         </w:tc>
@@ -1900,7 +2076,7 @@
                 <w:rFonts w:ascii="Times New Roman" w:hAnsi="Times New Roman" w:eastAsia="Times New Roman"/>
                 <w:sz w:val="22"/>
               </w:rPr>
-              <w:t xml:space="preserve">AI-image accuracy</w:t>
+              <w:t xml:space="preserve">Livestream commerce screenshots</w:t>
             </w:r>
           </w:p>
         </w:tc>
@@ -1909,14 +2085,14 @@
             <w:pPr>
               <w:pStyle w:val="Compact"/>
               <w:spacing w:line="480" w:lineRule="auto" w:before="0" w:after="0"/>
-              <w:jc w:val="left"/>
+              <w:jc w:val="right"/>
             </w:pPr>
             <w:r>
               <w:rPr>
                 <w:rFonts w:ascii="Times New Roman" w:hAnsi="Times New Roman" w:eastAsia="Times New Roman"/>
                 <w:sz w:val="22"/>
               </w:rPr>
-              <w:t xml:space="preserve">Mean accuracy across the 9 AI-generated images</w:t>
+              <w:t xml:space="preserve">58.3%</w:t>
             </w:r>
           </w:p>
         </w:tc>
@@ -1934,7 +2110,7 @@
                 <w:rFonts w:ascii="Times New Roman" w:hAnsi="Times New Roman" w:eastAsia="Times New Roman"/>
                 <w:sz w:val="22"/>
               </w:rPr>
-              <w:t xml:space="preserve">Real-image accuracy</w:t>
+              <w:t xml:space="preserve">Food photographs</w:t>
             </w:r>
           </w:p>
         </w:tc>
@@ -1943,14 +2119,14 @@
             <w:pPr>
               <w:pStyle w:val="Compact"/>
               <w:spacing w:line="480" w:lineRule="auto" w:before="0" w:after="0"/>
-              <w:jc w:val="left"/>
+              <w:jc w:val="right"/>
             </w:pPr>
             <w:r>
               <w:rPr>
                 <w:rFonts w:ascii="Times New Roman" w:hAnsi="Times New Roman" w:eastAsia="Times New Roman"/>
                 <w:sz w:val="22"/>
               </w:rPr>
-              <w:t xml:space="preserve">Mean accuracy across the 9 real images or screenshots</w:t>
+              <w:t xml:space="preserve">31.1%</w:t>
             </w:r>
           </w:p>
         </w:tc>
@@ -1968,7 +2144,7 @@
                 <w:rFonts w:ascii="Times New Roman" w:hAnsi="Times New Roman" w:eastAsia="Times New Roman"/>
                 <w:sz w:val="22"/>
               </w:rPr>
-              <w:t xml:space="preserve">Category accuracy</w:t>
+              <w:t xml:space="preserve">Virtual livestream interfaces</w:t>
             </w:r>
           </w:p>
         </w:tc>
@@ -1977,82 +2153,14 @@
             <w:pPr>
               <w:pStyle w:val="Compact"/>
               <w:spacing w:line="480" w:lineRule="auto" w:before="0" w:after="0"/>
-              <w:jc w:val="left"/>
+              <w:jc w:val="right"/>
             </w:pPr>
             <w:r>
               <w:rPr>
                 <w:rFonts w:ascii="Times New Roman" w:hAnsi="Times New Roman" w:eastAsia="Times New Roman"/>
                 <w:sz w:val="22"/>
               </w:rPr>
-              <w:t xml:space="preserve">Accuracy for text-bearing artifacts, portraits, livestream commerce screenshots, food photos, and virtual livestream interfaces</w:t>
-            </w:r>
-          </w:p>
-        </w:tc>
-      </w:tr>
-      <w:tr>
-        <w:tc>
-          <w:p>
-            <w:pPr>
-              <w:pStyle w:val="Compact"/>
-              <w:spacing w:line="480" w:lineRule="auto" w:before="0" w:after="0"/>
-              <w:jc w:val="left"/>
-            </w:pPr>
-            <w:r>
-              <w:rPr>
-                <w:rFonts w:ascii="Times New Roman" w:hAnsi="Times New Roman" w:eastAsia="Times New Roman"/>
-                <w:sz w:val="22"/>
-              </w:rPr>
-              <w:t xml:space="preserve">Trust rating</w:t>
-            </w:r>
-          </w:p>
-        </w:tc>
-        <w:tc>
-          <w:p>
-            <w:pPr>
-              <w:pStyle w:val="Compact"/>
-              <w:spacing w:line="480" w:lineRule="auto" w:before="0" w:after="0"/>
-              <w:jc w:val="left"/>
-            </w:pPr>
-            <w:r>
-              <w:rPr>
-                <w:rFonts w:ascii="Times New Roman" w:hAnsi="Times New Roman" w:eastAsia="Times New Roman"/>
-                <w:sz w:val="22"/>
-              </w:rPr>
-              <w:t xml:space="preserve">Mean trust rating for each image and for each category</w:t>
-            </w:r>
-          </w:p>
-        </w:tc>
-      </w:tr>
-      <w:tr>
-        <w:tc>
-          <w:p>
-            <w:pPr>
-              <w:pStyle w:val="Compact"/>
-              <w:spacing w:line="480" w:lineRule="auto" w:before="0" w:after="0"/>
-              <w:jc w:val="left"/>
-            </w:pPr>
-            <w:r>
-              <w:rPr>
-                <w:rFonts w:ascii="Times New Roman" w:hAnsi="Times New Roman" w:eastAsia="Times New Roman"/>
-                <w:sz w:val="22"/>
-              </w:rPr>
-              <w:t xml:space="preserve">Attitude items</w:t>
-            </w:r>
-          </w:p>
-        </w:tc>
-        <w:tc>
-          <w:p>
-            <w:pPr>
-              <w:pStyle w:val="Compact"/>
-              <w:spacing w:line="480" w:lineRule="auto" w:before="0" w:after="0"/>
-              <w:jc w:val="left"/>
-            </w:pPr>
-            <w:r>
-              <w:rPr>
-                <w:rFonts w:ascii="Times New Roman" w:hAnsi="Times New Roman" w:eastAsia="Times New Roman"/>
-                <w:sz w:val="22"/>
-              </w:rPr>
-              <w:t xml:space="preserve">Mean responses for general image trust, screenshot trust, verification habits, and self-confidence</w:t>
+              <w:t xml:space="preserve">54.5%</w:t>
             </w:r>
           </w:p>
         </w:tc>
@@ -2068,77 +2176,77 @@
           <w:rFonts w:ascii="Times New Roman" w:hAnsi="Times New Roman" w:eastAsia="Times New Roman"/>
           <w:sz w:val="22"/>
         </w:rPr>
-        <w:t xml:space="preserve">The expected analysis will compare performance across image source and image type. If</w:t>
-      </w:r>
-      <w:r>
-        <w:rPr>
-          <w:rFonts w:ascii="Times New Roman" w:hAnsi="Times New Roman" w:eastAsia="Times New Roman"/>
-          <w:sz w:val="22"/>
-        </w:rPr>
-        <w:t xml:space="preserve"> </w:t>
-      </w:r>
-      <w:r>
-        <w:rPr>
-          <w:rFonts w:ascii="Times New Roman" w:hAnsi="Times New Roman" w:eastAsia="Times New Roman"/>
-          <w:sz w:val="22"/>
-        </w:rPr>
-        <w:t xml:space="preserve">participants identify ordinary food or portrait photographs more accurately than livestream</w:t>
-      </w:r>
-      <w:r>
-        <w:rPr>
-          <w:rFonts w:ascii="Times New Roman" w:hAnsi="Times New Roman" w:eastAsia="Times New Roman"/>
-          <w:sz w:val="22"/>
-        </w:rPr>
-        <w:t xml:space="preserve"> </w:t>
-      </w:r>
-      <w:r>
-        <w:rPr>
-          <w:rFonts w:ascii="Times New Roman" w:hAnsi="Times New Roman" w:eastAsia="Times New Roman"/>
-          <w:sz w:val="22"/>
-        </w:rPr>
-        <w:t xml:space="preserve">or screenshot-like materials, this would support the idea that interface elements make visual</w:t>
-      </w:r>
-      <w:r>
-        <w:rPr>
-          <w:rFonts w:ascii="Times New Roman" w:hAnsi="Times New Roman" w:eastAsia="Times New Roman"/>
-          <w:sz w:val="22"/>
-        </w:rPr>
-        <w:t xml:space="preserve"> </w:t>
-      </w:r>
-      <w:r>
-        <w:rPr>
-          <w:rFonts w:ascii="Times New Roman" w:hAnsi="Times New Roman" w:eastAsia="Times New Roman"/>
-          <w:sz w:val="22"/>
-        </w:rPr>
-        <w:t xml:space="preserve">judgement harder. If AI-generated screenshots receive trust ratings close to real screenshots,</w:t>
-      </w:r>
-      <w:r>
-        <w:rPr>
-          <w:rFonts w:ascii="Times New Roman" w:hAnsi="Times New Roman" w:eastAsia="Times New Roman"/>
-          <w:sz w:val="22"/>
-        </w:rPr>
-        <w:t xml:space="preserve"> </w:t>
-      </w:r>
-      <w:r>
-        <w:rPr>
-          <w:rFonts w:ascii="Times New Roman" w:hAnsi="Times New Roman" w:eastAsia="Times New Roman"/>
-          <w:sz w:val="22"/>
-        </w:rPr>
-        <w:t xml:space="preserve">the result would suggest that synthetic images may not need to be perfectly detected in order</w:t>
-      </w:r>
-      <w:r>
-        <w:rPr>
-          <w:rFonts w:ascii="Times New Roman" w:hAnsi="Times New Roman" w:eastAsia="Times New Roman"/>
-          <w:sz w:val="22"/>
-        </w:rPr>
-        <w:t xml:space="preserve"> </w:t>
-      </w:r>
-      <w:r>
-        <w:rPr>
-          <w:rFonts w:ascii="Times New Roman" w:hAnsi="Times New Roman" w:eastAsia="Times New Roman"/>
-          <w:sz w:val="22"/>
-        </w:rPr>
-        <w:t xml:space="preserve">to influence perceived credibility.</w:t>
+        <w:t xml:space="preserve">Category-level results show that livestream commerce screenshots and text-bearing visual</w:t>
+      </w:r>
+      <w:r>
+        <w:rPr>
+          <w:rFonts w:ascii="Times New Roman" w:hAnsi="Times New Roman" w:eastAsia="Times New Roman"/>
+          <w:sz w:val="22"/>
+        </w:rPr>
+        <w:t xml:space="preserve"> </w:t>
+      </w:r>
+      <w:r>
+        <w:rPr>
+          <w:rFonts w:ascii="Times New Roman" w:hAnsi="Times New Roman" w:eastAsia="Times New Roman"/>
+          <w:sz w:val="22"/>
+        </w:rPr>
+        <w:t xml:space="preserve">artifacts produced the highest accuracy in this sample, while food photographs produced the</w:t>
+      </w:r>
+      <w:r>
+        <w:rPr>
+          <w:rFonts w:ascii="Times New Roman" w:hAnsi="Times New Roman" w:eastAsia="Times New Roman"/>
+          <w:sz w:val="22"/>
+        </w:rPr>
+        <w:t xml:space="preserve"> </w:t>
+      </w:r>
+      <w:r>
+        <w:rPr>
+          <w:rFonts w:ascii="Times New Roman" w:hAnsi="Times New Roman" w:eastAsia="Times New Roman"/>
+          <w:sz w:val="22"/>
+        </w:rPr>
+        <w:t xml:space="preserve">lowest accuracy. The food-photo result is especially important because both real food images</w:t>
+      </w:r>
+      <w:r>
+        <w:rPr>
+          <w:rFonts w:ascii="Times New Roman" w:hAnsi="Times New Roman" w:eastAsia="Times New Roman"/>
+          <w:sz w:val="22"/>
+        </w:rPr>
+        <w:t xml:space="preserve"> </w:t>
+      </w:r>
+      <w:r>
+        <w:rPr>
+          <w:rFonts w:ascii="Times New Roman" w:hAnsi="Times New Roman" w:eastAsia="Times New Roman"/>
+          <w:sz w:val="22"/>
+        </w:rPr>
+        <w:t xml:space="preserve">were frequently judged as AI-generated. This supports the broader claim that the spread of</w:t>
+      </w:r>
+      <w:r>
+        <w:rPr>
+          <w:rFonts w:ascii="Times New Roman" w:hAnsi="Times New Roman" w:eastAsia="Times New Roman"/>
+          <w:sz w:val="22"/>
+        </w:rPr>
+        <w:t xml:space="preserve"> </w:t>
+      </w:r>
+      <w:r>
+        <w:rPr>
+          <w:rFonts w:ascii="Times New Roman" w:hAnsi="Times New Roman" w:eastAsia="Times New Roman"/>
+          <w:sz w:val="22"/>
+        </w:rPr>
+        <w:t xml:space="preserve">AI-generated images can create uncertainty not only about synthetic images, but also about</w:t>
+      </w:r>
+      <w:r>
+        <w:rPr>
+          <w:rFonts w:ascii="Times New Roman" w:hAnsi="Times New Roman" w:eastAsia="Times New Roman"/>
+          <w:sz w:val="22"/>
+        </w:rPr>
+        <w:t xml:space="preserve"> </w:t>
+      </w:r>
+      <w:r>
+        <w:rPr>
+          <w:rFonts w:ascii="Times New Roman" w:hAnsi="Times New Roman" w:eastAsia="Times New Roman"/>
+          <w:sz w:val="22"/>
+        </w:rPr>
+        <w:t xml:space="preserve">real images that happen to look polished or artificial.</w:t>
       </w:r>
     </w:p>
     <w:p>
@@ -2151,91 +2259,355 @@
           <w:rFonts w:ascii="Times New Roman" w:hAnsi="Times New Roman" w:eastAsia="Times New Roman"/>
           <w:sz w:val="22"/>
         </w:rPr>
-        <w:t xml:space="preserve">The results will be interpreted together with the existing literature rather than as a</w:t>
-      </w:r>
-      <w:r>
-        <w:rPr>
-          <w:rFonts w:ascii="Times New Roman" w:hAnsi="Times New Roman" w:eastAsia="Times New Roman"/>
-          <w:sz w:val="22"/>
-        </w:rPr>
-        <w:t xml:space="preserve"> </w:t>
-      </w:r>
-      <w:r>
-        <w:rPr>
-          <w:rFonts w:ascii="Times New Roman" w:hAnsi="Times New Roman" w:eastAsia="Times New Roman"/>
-          <w:sz w:val="22"/>
-        </w:rPr>
-        <w:t xml:space="preserve">standalone experiment. If the survey shows low detection accuracy, it will align with earlier</w:t>
-      </w:r>
-      <w:r>
-        <w:rPr>
-          <w:rFonts w:ascii="Times New Roman" w:hAnsi="Times New Roman" w:eastAsia="Times New Roman"/>
-          <w:sz w:val="22"/>
-        </w:rPr>
-        <w:t xml:space="preserve"> </w:t>
-      </w:r>
-      <w:r>
-        <w:rPr>
-          <w:rFonts w:ascii="Times New Roman" w:hAnsi="Times New Roman" w:eastAsia="Times New Roman"/>
-          <w:sz w:val="22"/>
-        </w:rPr>
-        <w:t xml:space="preserve">findings that human detection of synthetic visual media is limited. If participants express</w:t>
-      </w:r>
-      <w:r>
-        <w:rPr>
-          <w:rFonts w:ascii="Times New Roman" w:hAnsi="Times New Roman" w:eastAsia="Times New Roman"/>
-          <w:sz w:val="22"/>
-        </w:rPr>
-        <w:t xml:space="preserve"> </w:t>
-      </w:r>
-      <w:r>
-        <w:rPr>
-          <w:rFonts w:ascii="Times New Roman" w:hAnsi="Times New Roman" w:eastAsia="Times New Roman"/>
-          <w:sz w:val="22"/>
-        </w:rPr>
-        <w:t xml:space="preserve">high confidence but show low accuracy, this will suggest a gap between perceived and actual</w:t>
-      </w:r>
-      <w:r>
-        <w:rPr>
-          <w:rFonts w:ascii="Times New Roman" w:hAnsi="Times New Roman" w:eastAsia="Times New Roman"/>
-          <w:sz w:val="22"/>
-        </w:rPr>
-        <w:t xml:space="preserve"> </w:t>
-      </w:r>
-      <w:r>
-        <w:rPr>
-          <w:rFonts w:ascii="Times New Roman" w:hAnsi="Times New Roman" w:eastAsia="Times New Roman"/>
-          <w:sz w:val="22"/>
-        </w:rPr>
-        <w:t xml:space="preserve">media literacy. Finally, if screenshot-like AI materials receive relatively high trust</w:t>
-      </w:r>
-      <w:r>
-        <w:rPr>
-          <w:rFonts w:ascii="Times New Roman" w:hAnsi="Times New Roman" w:eastAsia="Times New Roman"/>
-          <w:sz w:val="22"/>
-        </w:rPr>
-        <w:t xml:space="preserve"> </w:t>
-      </w:r>
-      <w:r>
-        <w:rPr>
-          <w:rFonts w:ascii="Times New Roman" w:hAnsi="Times New Roman" w:eastAsia="Times New Roman"/>
-          <w:sz w:val="22"/>
-        </w:rPr>
-        <w:t xml:space="preserve">ratings, the study will support the broader claim that generative AI threatens not only the</w:t>
-      </w:r>
-      <w:r>
-        <w:rPr>
-          <w:rFonts w:ascii="Times New Roman" w:hAnsi="Times New Roman" w:eastAsia="Times New Roman"/>
-          <w:sz w:val="22"/>
-        </w:rPr>
-        <w:t xml:space="preserve"> </w:t>
-      </w:r>
-      <w:r>
-        <w:rPr>
-          <w:rFonts w:ascii="Times New Roman" w:hAnsi="Times New Roman" w:eastAsia="Times New Roman"/>
-          <w:sz w:val="22"/>
-        </w:rPr>
-        <w:t xml:space="preserve">truth of individual images but also the social reliability of screenshots as evidence.</w:t>
+        <w:t xml:space="preserve">Trust ratings were measured on a five-point scale from 1 (</w:t>
+      </w:r>
+      <w:r>
+        <w:rPr>
+          <w:rFonts w:ascii="Times New Roman" w:hAnsi="Times New Roman" w:eastAsia="Times New Roman"/>
+          <w:sz w:val="22"/>
+        </w:rPr>
+        <w:t xml:space="preserve">“</w:t>
+      </w:r>
+      <w:r>
+        <w:rPr>
+          <w:rFonts w:ascii="Times New Roman" w:hAnsi="Times New Roman" w:eastAsia="Times New Roman"/>
+          <w:sz w:val="22"/>
+        </w:rPr>
+        <w:t xml:space="preserve">not trustworthy at all</w:t>
+      </w:r>
+      <w:r>
+        <w:rPr>
+          <w:rFonts w:ascii="Times New Roman" w:hAnsi="Times New Roman" w:eastAsia="Times New Roman"/>
+          <w:sz w:val="22"/>
+        </w:rPr>
+        <w:t xml:space="preserve">”</w:t>
+      </w:r>
+      <w:r>
+        <w:rPr>
+          <w:rFonts w:ascii="Times New Roman" w:hAnsi="Times New Roman" w:eastAsia="Times New Roman"/>
+          <w:sz w:val="22"/>
+        </w:rPr>
+        <w:t xml:space="preserve">) to 5</w:t>
+      </w:r>
+      <w:r>
+        <w:rPr>
+          <w:rFonts w:ascii="Times New Roman" w:hAnsi="Times New Roman" w:eastAsia="Times New Roman"/>
+          <w:sz w:val="22"/>
+        </w:rPr>
+        <w:t xml:space="preserve"> </w:t>
+      </w:r>
+      <w:r>
+        <w:rPr>
+          <w:rFonts w:ascii="Times New Roman" w:hAnsi="Times New Roman" w:eastAsia="Times New Roman"/>
+          <w:sz w:val="22"/>
+        </w:rPr>
+        <w:t xml:space="preserve">(</w:t>
+      </w:r>
+      <w:r>
+        <w:rPr>
+          <w:rFonts w:ascii="Times New Roman" w:hAnsi="Times New Roman" w:eastAsia="Times New Roman"/>
+          <w:sz w:val="22"/>
+        </w:rPr>
+        <w:t xml:space="preserve">“</w:t>
+      </w:r>
+      <w:r>
+        <w:rPr>
+          <w:rFonts w:ascii="Times New Roman" w:hAnsi="Times New Roman" w:eastAsia="Times New Roman"/>
+          <w:sz w:val="22"/>
+        </w:rPr>
+        <w:t xml:space="preserve">very trustworthy</w:t>
+      </w:r>
+      <w:r>
+        <w:rPr>
+          <w:rFonts w:ascii="Times New Roman" w:hAnsi="Times New Roman" w:eastAsia="Times New Roman"/>
+          <w:sz w:val="22"/>
+        </w:rPr>
+        <w:t xml:space="preserve">”</w:t>
+      </w:r>
+      <w:r>
+        <w:rPr>
+          <w:rFonts w:ascii="Times New Roman" w:hAnsi="Times New Roman" w:eastAsia="Times New Roman"/>
+          <w:sz w:val="22"/>
+        </w:rPr>
+        <w:t xml:space="preserve">). Real images received a slightly higher mean trust rating (M = 2.99)</w:t>
+      </w:r>
+      <w:r>
+        <w:rPr>
+          <w:rFonts w:ascii="Times New Roman" w:hAnsi="Times New Roman" w:eastAsia="Times New Roman"/>
+          <w:sz w:val="22"/>
+        </w:rPr>
+        <w:t xml:space="preserve"> </w:t>
+      </w:r>
+      <w:r>
+        <w:rPr>
+          <w:rFonts w:ascii="Times New Roman" w:hAnsi="Times New Roman" w:eastAsia="Times New Roman"/>
+          <w:sz w:val="22"/>
+        </w:rPr>
+        <w:t xml:space="preserve">than AI-generated images (M = 2.70), but the difference was modest. By category, portrait</w:t>
+      </w:r>
+      <w:r>
+        <w:rPr>
+          <w:rFonts w:ascii="Times New Roman" w:hAnsi="Times New Roman" w:eastAsia="Times New Roman"/>
+          <w:sz w:val="22"/>
+        </w:rPr>
+        <w:t xml:space="preserve"> </w:t>
+      </w:r>
+      <w:r>
+        <w:rPr>
+          <w:rFonts w:ascii="Times New Roman" w:hAnsi="Times New Roman" w:eastAsia="Times New Roman"/>
+          <w:sz w:val="22"/>
+        </w:rPr>
+        <w:t xml:space="preserve">images received the highest average trust rating (M = 3.14), followed by text-bearing visual</w:t>
+      </w:r>
+      <w:r>
+        <w:rPr>
+          <w:rFonts w:ascii="Times New Roman" w:hAnsi="Times New Roman" w:eastAsia="Times New Roman"/>
+          <w:sz w:val="22"/>
+        </w:rPr>
+        <w:t xml:space="preserve"> </w:t>
+      </w:r>
+      <w:r>
+        <w:rPr>
+          <w:rFonts w:ascii="Times New Roman" w:hAnsi="Times New Roman" w:eastAsia="Times New Roman"/>
+          <w:sz w:val="22"/>
+        </w:rPr>
+        <w:t xml:space="preserve">artifacts (M = 2.98), virtual livestream interfaces (M = 2.73), livestream commerce</w:t>
+      </w:r>
+      <w:r>
+        <w:rPr>
+          <w:rFonts w:ascii="Times New Roman" w:hAnsi="Times New Roman" w:eastAsia="Times New Roman"/>
+          <w:sz w:val="22"/>
+        </w:rPr>
+        <w:t xml:space="preserve"> </w:t>
+      </w:r>
+      <w:r>
+        <w:rPr>
+          <w:rFonts w:ascii="Times New Roman" w:hAnsi="Times New Roman" w:eastAsia="Times New Roman"/>
+          <w:sz w:val="22"/>
+        </w:rPr>
+        <w:t xml:space="preserve">screenshots (M = 2.70), and food photographs (M = 2.62).</w:t>
+      </w:r>
+    </w:p>
+    <w:p>
+      <w:pPr>
+        <w:pStyle w:val="BodyText"/>
+        <w:spacing w:line="480" w:lineRule="auto" w:before="0" w:after="0"/>
+      </w:pPr>
+      <w:r>
+        <w:rPr>
+          <w:rFonts w:ascii="Times New Roman" w:hAnsi="Times New Roman" w:eastAsia="Times New Roman"/>
+          <w:sz w:val="22"/>
+        </w:rPr>
+        <w:t xml:space="preserve">The attitude items also show a cautious pattern of media trust. Respondents generally did not</w:t>
+      </w:r>
+      <w:r>
+        <w:rPr>
+          <w:rFonts w:ascii="Times New Roman" w:hAnsi="Times New Roman" w:eastAsia="Times New Roman"/>
+          <w:sz w:val="22"/>
+        </w:rPr>
+        <w:t xml:space="preserve"> </w:t>
+      </w:r>
+      <w:r>
+        <w:rPr>
+          <w:rFonts w:ascii="Times New Roman" w:hAnsi="Times New Roman" w:eastAsia="Times New Roman"/>
+          <w:sz w:val="22"/>
+        </w:rPr>
+        <w:t xml:space="preserve">agree that online images and screenshots usually reflect reality (M = 2.39). At the same</w:t>
+      </w:r>
+      <w:r>
+        <w:rPr>
+          <w:rFonts w:ascii="Times New Roman" w:hAnsi="Times New Roman" w:eastAsia="Times New Roman"/>
+          <w:sz w:val="22"/>
+        </w:rPr>
+        <w:t xml:space="preserve"> </w:t>
+      </w:r>
+      <w:r>
+        <w:rPr>
+          <w:rFonts w:ascii="Times New Roman" w:hAnsi="Times New Roman" w:eastAsia="Times New Roman"/>
+          <w:sz w:val="22"/>
+        </w:rPr>
+        <w:t xml:space="preserve">time, nearly half of the valid respondents agreed or strongly agreed that platform elements</w:t>
+      </w:r>
+      <w:r>
+        <w:rPr>
+          <w:rFonts w:ascii="Times New Roman" w:hAnsi="Times New Roman" w:eastAsia="Times New Roman"/>
+          <w:sz w:val="22"/>
+        </w:rPr>
+        <w:t xml:space="preserve"> </w:t>
+      </w:r>
+      <w:r>
+        <w:rPr>
+          <w:rFonts w:ascii="Times New Roman" w:hAnsi="Times New Roman" w:eastAsia="Times New Roman"/>
+          <w:sz w:val="22"/>
+        </w:rPr>
+        <w:t xml:space="preserve">such as interfaces, comments, or livestream features can make screenshots more believable.</w:t>
+      </w:r>
+      <w:r>
+        <w:rPr>
+          <w:rFonts w:ascii="Times New Roman" w:hAnsi="Times New Roman" w:eastAsia="Times New Roman"/>
+          <w:sz w:val="22"/>
+        </w:rPr>
+        <w:t xml:space="preserve"> </w:t>
+      </w:r>
+      <w:r>
+        <w:rPr>
+          <w:rFonts w:ascii="Times New Roman" w:hAnsi="Times New Roman" w:eastAsia="Times New Roman"/>
+          <w:sz w:val="22"/>
+        </w:rPr>
+        <w:t xml:space="preserve">Most respondents also reported verification habits: 42 out of 66 agreed or strongly agreed</w:t>
+      </w:r>
+      <w:r>
+        <w:rPr>
+          <w:rFonts w:ascii="Times New Roman" w:hAnsi="Times New Roman" w:eastAsia="Times New Roman"/>
+          <w:sz w:val="22"/>
+        </w:rPr>
+        <w:t xml:space="preserve"> </w:t>
+      </w:r>
+      <w:r>
+        <w:rPr>
+          <w:rFonts w:ascii="Times New Roman" w:hAnsi="Times New Roman" w:eastAsia="Times New Roman"/>
+          <w:sz w:val="22"/>
+        </w:rPr>
+        <w:t xml:space="preserve">that they would look for sources or context when seeing realistic online images or</w:t>
+      </w:r>
+      <w:r>
+        <w:rPr>
+          <w:rFonts w:ascii="Times New Roman" w:hAnsi="Times New Roman" w:eastAsia="Times New Roman"/>
+          <w:sz w:val="22"/>
+        </w:rPr>
+        <w:t xml:space="preserve"> </w:t>
+      </w:r>
+      <w:r>
+        <w:rPr>
+          <w:rFonts w:ascii="Times New Roman" w:hAnsi="Times New Roman" w:eastAsia="Times New Roman"/>
+          <w:sz w:val="22"/>
+        </w:rPr>
+        <w:t xml:space="preserve">screenshots. However, confidence in personal judgement was moderate to low (M = 2.83), with</w:t>
+      </w:r>
+      <w:r>
+        <w:rPr>
+          <w:rFonts w:ascii="Times New Roman" w:hAnsi="Times New Roman" w:eastAsia="Times New Roman"/>
+          <w:sz w:val="22"/>
+        </w:rPr>
+        <w:t xml:space="preserve"> </w:t>
+      </w:r>
+      <w:r>
+        <w:rPr>
+          <w:rFonts w:ascii="Times New Roman" w:hAnsi="Times New Roman" w:eastAsia="Times New Roman"/>
+          <w:sz w:val="22"/>
+        </w:rPr>
+        <w:t xml:space="preserve">only 17 out of 66 agreeing or strongly agreeing that they were confident in judging whether</w:t>
+      </w:r>
+      <w:r>
+        <w:rPr>
+          <w:rFonts w:ascii="Times New Roman" w:hAnsi="Times New Roman" w:eastAsia="Times New Roman"/>
+          <w:sz w:val="22"/>
+        </w:rPr>
+        <w:t xml:space="preserve"> </w:t>
+      </w:r>
+      <w:r>
+        <w:rPr>
+          <w:rFonts w:ascii="Times New Roman" w:hAnsi="Times New Roman" w:eastAsia="Times New Roman"/>
+          <w:sz w:val="22"/>
+        </w:rPr>
+        <w:t xml:space="preserve">online images were real.</w:t>
+      </w:r>
+    </w:p>
+    <w:p>
+      <w:pPr>
+        <w:pStyle w:val="BodyText"/>
+        <w:spacing w:line="480" w:lineRule="auto" w:before="0" w:after="0"/>
+      </w:pPr>
+      <w:r>
+        <w:rPr>
+          <w:rFonts w:ascii="Times New Roman" w:hAnsi="Times New Roman" w:eastAsia="Times New Roman"/>
+          <w:sz w:val="22"/>
+        </w:rPr>
+        <w:t xml:space="preserve">The local survey results fit the broader pattern in the literature. Participants did not show</w:t>
+      </w:r>
+      <w:r>
+        <w:rPr>
+          <w:rFonts w:ascii="Times New Roman" w:hAnsi="Times New Roman" w:eastAsia="Times New Roman"/>
+          <w:sz w:val="22"/>
+        </w:rPr>
+        <w:t xml:space="preserve"> </w:t>
+      </w:r>
+      <w:r>
+        <w:rPr>
+          <w:rFonts w:ascii="Times New Roman" w:hAnsi="Times New Roman" w:eastAsia="Times New Roman"/>
+          <w:sz w:val="22"/>
+        </w:rPr>
+        <w:t xml:space="preserve">stable or highly accurate source judgement; fewer than half of all image classifications were</w:t>
+      </w:r>
+      <w:r>
+        <w:rPr>
+          <w:rFonts w:ascii="Times New Roman" w:hAnsi="Times New Roman" w:eastAsia="Times New Roman"/>
+          <w:sz w:val="22"/>
+        </w:rPr>
+        <w:t xml:space="preserve"> </w:t>
+      </w:r>
+      <w:r>
+        <w:rPr>
+          <w:rFonts w:ascii="Times New Roman" w:hAnsi="Times New Roman" w:eastAsia="Times New Roman"/>
+          <w:sz w:val="22"/>
+        </w:rPr>
+        <w:t xml:space="preserve">correct. AI-generated images were identified more accurately than real images, which suggests</w:t>
+      </w:r>
+      <w:r>
+        <w:rPr>
+          <w:rFonts w:ascii="Times New Roman" w:hAnsi="Times New Roman" w:eastAsia="Times New Roman"/>
+          <w:sz w:val="22"/>
+        </w:rPr>
+        <w:t xml:space="preserve"> </w:t>
+      </w:r>
+      <w:r>
+        <w:rPr>
+          <w:rFonts w:ascii="Times New Roman" w:hAnsi="Times New Roman" w:eastAsia="Times New Roman"/>
+          <w:sz w:val="22"/>
+        </w:rPr>
+        <w:t xml:space="preserve">that the problem is not only the acceptance of fake images, but also the erosion of trust in</w:t>
+      </w:r>
+      <w:r>
+        <w:rPr>
+          <w:rFonts w:ascii="Times New Roman" w:hAnsi="Times New Roman" w:eastAsia="Times New Roman"/>
+          <w:sz w:val="22"/>
+        </w:rPr>
+        <w:t xml:space="preserve"> </w:t>
+      </w:r>
+      <w:r>
+        <w:rPr>
+          <w:rFonts w:ascii="Times New Roman" w:hAnsi="Times New Roman" w:eastAsia="Times New Roman"/>
+          <w:sz w:val="22"/>
+        </w:rPr>
+        <w:t xml:space="preserve">real visual materials. Overall, the survey supports the paper’s main argument: as</w:t>
+      </w:r>
+      <w:r>
+        <w:rPr>
+          <w:rFonts w:ascii="Times New Roman" w:hAnsi="Times New Roman" w:eastAsia="Times New Roman"/>
+          <w:sz w:val="22"/>
+        </w:rPr>
+        <w:t xml:space="preserve"> </w:t>
+      </w:r>
+      <w:r>
+        <w:rPr>
+          <w:rFonts w:ascii="Times New Roman" w:hAnsi="Times New Roman" w:eastAsia="Times New Roman"/>
+          <w:sz w:val="22"/>
+        </w:rPr>
+        <w:t xml:space="preserve">AI-generated images become more realistic, ordinary visual judgement becomes a fragile basis</w:t>
+      </w:r>
+      <w:r>
+        <w:rPr>
+          <w:rFonts w:ascii="Times New Roman" w:hAnsi="Times New Roman" w:eastAsia="Times New Roman"/>
+          <w:sz w:val="22"/>
+        </w:rPr>
+        <w:t xml:space="preserve"> </w:t>
+      </w:r>
+      <w:r>
+        <w:rPr>
+          <w:rFonts w:ascii="Times New Roman" w:hAnsi="Times New Roman" w:eastAsia="Times New Roman"/>
+          <w:sz w:val="22"/>
+        </w:rPr>
+        <w:t xml:space="preserve">for deciding what online images and screenshots should be trusted.</w:t>
       </w:r>
     </w:p>
     <w:bookmarkEnd w:id="28"/>

</xml_diff>